<commit_message>
Topic Diversity Method Document Addition
</commit_message>
<xml_diff>
--- a/Methods/Topic Introduction.docx
+++ b/Methods/Topic Introduction.docx
@@ -367,6 +367,49 @@
           <w:szCs w:val="30"/>
         </w:rPr>
         <w:t>A countries topic introduction score was then the sum of 1/len(document[“parties”]), for each topic introducing document they were a co-author of.</w:t>
+      </w:r>
+    </w:p>
+    <w:p>
+      <w:pPr>
+        <w:pStyle w:val="Normal"/>
+        <w:bidi w:val="0"/>
+        <w:jc w:val="start"/>
+        <w:rPr>
+          <w:b w:val="false"/>
+          <w:bCs w:val="false"/>
+          <w:sz w:val="30"/>
+          <w:szCs w:val="30"/>
+        </w:rPr>
+      </w:pPr>
+      <w:r>
+        <w:rPr>
+          <w:b w:val="false"/>
+          <w:bCs w:val="false"/>
+          <w:sz w:val="30"/>
+          <w:szCs w:val="30"/>
+        </w:rPr>
+      </w:r>
+    </w:p>
+    <w:p>
+      <w:pPr>
+        <w:pStyle w:val="Normal"/>
+        <w:bidi w:val="0"/>
+        <w:jc w:val="start"/>
+        <w:rPr>
+          <w:b w:val="false"/>
+          <w:bCs w:val="false"/>
+          <w:sz w:val="30"/>
+          <w:szCs w:val="30"/>
+        </w:rPr>
+      </w:pPr>
+      <w:r>
+        <w:rPr>
+          <w:b w:val="false"/>
+          <w:bCs w:val="false"/>
+          <w:sz w:val="30"/>
+          <w:szCs w:val="30"/>
+        </w:rPr>
+        <w:t>A countries topic diversity score was the number of topics they had written a Working Paper in.</w:t>
       </w:r>
     </w:p>
     <w:sectPr>

</xml_diff>